<commit_message>
Update final report with full benchmark results
Co-Authored-By: Claude Opus 5.5 <noreply@anthropic.com>
Claude-Session: https://claude.ai/code/session_019fHkCEb95TPoKGeBSfeUvU
</commit_message>
<xml_diff>
--- a/docs/Final_Report_SOC_Agentic_Triage.docx
+++ b/docs/Final_Report_SOC_Agentic_Triage.docx
@@ -2816,7 +2816,7 @@
           <w:sz w:val="22"/>
           <w:szCs w:val="22"/>
         </w:rPr>
-        <w:t xml:space="preserve">	30</w:t>
+        <w:t xml:space="preserve">	31</w:t>
       </w:r>
     </w:p>
     <w:p>
@@ -2847,7 +2847,7 @@
           <w:sz w:val="20"/>
           <w:szCs w:val="20"/>
         </w:rPr>
-        <w:t xml:space="preserve">	30</w:t>
+        <w:t xml:space="preserve">	31</w:t>
       </w:r>
     </w:p>
     <w:p>
@@ -2878,7 +2878,7 @@
           <w:sz w:val="20"/>
           <w:szCs w:val="20"/>
         </w:rPr>
-        <w:t xml:space="preserve">	30</w:t>
+        <w:t xml:space="preserve">	31</w:t>
       </w:r>
     </w:p>
     <w:p>
@@ -2909,7 +2909,7 @@
           <w:sz w:val="20"/>
           <w:szCs w:val="20"/>
         </w:rPr>
-        <w:t xml:space="preserve">	31</w:t>
+        <w:t xml:space="preserve">	32</w:t>
       </w:r>
     </w:p>
     <w:p>
@@ -2940,7 +2940,7 @@
           <w:sz w:val="20"/>
           <w:szCs w:val="20"/>
         </w:rPr>
-        <w:t xml:space="preserve">	32</w:t>
+        <w:t xml:space="preserve">	33</w:t>
       </w:r>
     </w:p>
     <w:p>
@@ -2971,7 +2971,7 @@
           <w:sz w:val="22"/>
           <w:szCs w:val="22"/>
         </w:rPr>
-        <w:t xml:space="preserve">	33</w:t>
+        <w:t xml:space="preserve">	34</w:t>
       </w:r>
     </w:p>
     <w:p>
@@ -3002,7 +3002,7 @@
           <w:sz w:val="20"/>
           <w:szCs w:val="20"/>
         </w:rPr>
-        <w:t xml:space="preserve">	33</w:t>
+        <w:t xml:space="preserve">	34</w:t>
       </w:r>
     </w:p>
     <w:p>
@@ -3033,7 +3033,7 @@
           <w:sz w:val="20"/>
           <w:szCs w:val="20"/>
         </w:rPr>
-        <w:t xml:space="preserve">	33</w:t>
+        <w:t xml:space="preserve">	34</w:t>
       </w:r>
     </w:p>
     <w:p>
@@ -3064,7 +3064,7 @@
           <w:sz w:val="22"/>
           <w:szCs w:val="22"/>
         </w:rPr>
-        <w:t xml:space="preserve">	35</w:t>
+        <w:t xml:space="preserve">	36</w:t>
       </w:r>
     </w:p>
     <w:p>
@@ -3095,7 +3095,7 @@
           <w:sz w:val="22"/>
           <w:szCs w:val="22"/>
         </w:rPr>
-        <w:t xml:space="preserve">	37</w:t>
+        <w:t xml:space="preserve">	38</w:t>
       </w:r>
     </w:p>
     <w:p>
@@ -3126,7 +3126,7 @@
           <w:sz w:val="20"/>
           <w:szCs w:val="20"/>
         </w:rPr>
-        <w:t xml:space="preserve">	37</w:t>
+        <w:t xml:space="preserve">	38</w:t>
       </w:r>
     </w:p>
     <w:p>
@@ -3157,7 +3157,7 @@
           <w:sz w:val="20"/>
           <w:szCs w:val="20"/>
         </w:rPr>
-        <w:t xml:space="preserve">	37</w:t>
+        <w:t xml:space="preserve">	38</w:t>
       </w:r>
     </w:p>
     <w:p>
@@ -3188,7 +3188,7 @@
           <w:sz w:val="20"/>
           <w:szCs w:val="20"/>
         </w:rPr>
-        <w:t xml:space="preserve">	37</w:t>
+        <w:t xml:space="preserve">	38</w:t>
       </w:r>
     </w:p>
     <w:p>
@@ -3219,7 +3219,7 @@
           <w:sz w:val="20"/>
           <w:szCs w:val="20"/>
         </w:rPr>
-        <w:t xml:space="preserve">	37</w:t>
+        <w:t xml:space="preserve">	38</w:t>
       </w:r>
     </w:p>
     <w:p>
@@ -3472,7 +3472,7 @@
           <w:sz w:val="22"/>
           <w:szCs w:val="22"/>
         </w:rPr>
-        <w:t xml:space="preserve"> open-weight models (GPT-OSS 20B, GPT-OSS 120B and Qwen 3.8 27B) on identical cases. Both GPT-OSS models reached the correct final risk class in every scored run, against 50% for Qwen 3.8 27B, and GPT-OSS 120B matched the expected route most often (83%), so it is our recommended model for a pilot. An industry expert, </w:t>
+        <w:t xml:space="preserve"> open-weight models (GPT-OSS 20B, GPT-OSS 120B and Qwen 3.8 27B) on identical cases, 15 runs each. Both GPT-OSS models reached the correct final risk class in every scored run (Qwen 3.8 27B: 57%), no model missed an attack, and GPT-OSS 120B completed the most cases on the expected route (87%) with the most reliable structured output (98% valid JSON first time), so it is our recommended model for a pilot. An industry expert, </w:t>
       </w:r>
       <w:r>
         <w:rPr>
@@ -21744,7 +21744,7 @@
           <w:sz w:val="22"/>
           <w:szCs w:val="22"/>
         </w:rPr>
-        <w:t xml:space="preserve"> The benchmark completed 6 scored runs for each GPT-OSS model and 20 for Qwen 3.8 27B. The sample is small and unequal, so the results below are indicative rather than statistically conclusive.</w:t>
+        <w:t xml:space="preserve"> Each model completed 15 runs (5 alerts × 3 repeats). Two Qwen runs timed out at the provider and are excluded from its accuracy figures but counted against its completion.</w:t>
       </w:r>
     </w:p>
     <w:tbl>
@@ -21944,7 +21944,7 @@
                 <w:sz w:val="19"/>
                 <w:szCs w:val="19"/>
               </w:rPr>
-              <w:t xml:space="preserve">Runs scored</w:t>
+              <w:t xml:space="preserve">Runs</w:t>
             </w:r>
           </w:p>
         </w:tc>
@@ -21976,7 +21976,7 @@
                 <w:sz w:val="19"/>
                 <w:szCs w:val="19"/>
               </w:rPr>
-              <w:t xml:space="preserve">6</w:t>
+              <w:t xml:space="preserve">15</w:t>
             </w:r>
           </w:p>
         </w:tc>
@@ -22008,7 +22008,7 @@
                 <w:sz w:val="19"/>
                 <w:szCs w:val="19"/>
               </w:rPr>
-              <w:t xml:space="preserve">6</w:t>
+              <w:t xml:space="preserve">15</w:t>
             </w:r>
           </w:p>
         </w:tc>
@@ -22040,7 +22040,7 @@
                 <w:sz w:val="19"/>
                 <w:szCs w:val="19"/>
               </w:rPr>
-              <w:t xml:space="preserve">20</w:t>
+              <w:t xml:space="preserve">15</w:t>
             </w:r>
           </w:p>
         </w:tc>
@@ -22178,7 +22178,7 @@
                 <w:sz w:val="19"/>
                 <w:szCs w:val="19"/>
               </w:rPr>
-              <w:t xml:space="preserve">50% / 50%</w:t>
+              <w:t xml:space="preserve">57% / 57%</w:t>
             </w:r>
           </w:p>
         </w:tc>
@@ -22250,7 +22250,7 @@
                 <w:sz w:val="19"/>
                 <w:szCs w:val="19"/>
               </w:rPr>
-              <w:t xml:space="preserve">75%</w:t>
+              <w:t xml:space="preserve">78%</w:t>
             </w:r>
           </w:p>
         </w:tc>
@@ -22282,7 +22282,7 @@
                 <w:sz w:val="19"/>
                 <w:szCs w:val="19"/>
               </w:rPr>
-              <w:t xml:space="preserve">50%</w:t>
+              <w:t xml:space="preserve">33%</w:t>
             </w:r>
           </w:p>
         </w:tc>
@@ -22314,7 +22314,7 @@
                 <w:sz w:val="19"/>
                 <w:szCs w:val="19"/>
               </w:rPr>
-              <w:t xml:space="preserve">50%</w:t>
+              <w:t xml:space="preserve">57%</w:t>
             </w:r>
           </w:p>
         </w:tc>
@@ -22352,7 +22352,7 @@
                 <w:sz w:val="19"/>
                 <w:szCs w:val="19"/>
               </w:rPr>
-              <w:t xml:space="preserve">Incident category correct</w:t>
+              <w:t xml:space="preserve">Incident category / recommended action correct</w:t>
             </w:r>
           </w:p>
         </w:tc>
@@ -22386,7 +22386,7 @@
                 <w:sz w:val="19"/>
                 <w:szCs w:val="19"/>
               </w:rPr>
-              <w:t xml:space="preserve">75%</w:t>
+              <w:t xml:space="preserve">89% / 78%</w:t>
             </w:r>
           </w:p>
         </w:tc>
@@ -22418,7 +22418,7 @@
                 <w:sz w:val="19"/>
                 <w:szCs w:val="19"/>
               </w:rPr>
-              <w:t xml:space="preserve">25%</w:t>
+              <w:t xml:space="preserve">44% / 56%</w:t>
             </w:r>
           </w:p>
         </w:tc>
@@ -22450,7 +22450,7 @@
                 <w:sz w:val="19"/>
                 <w:szCs w:val="19"/>
               </w:rPr>
-              <w:t xml:space="preserve">50%</w:t>
+              <w:t xml:space="preserve">57% / 57%</w:t>
             </w:r>
           </w:p>
         </w:tc>
@@ -22488,7 +22488,39 @@
                 <w:sz w:val="19"/>
                 <w:szCs w:val="19"/>
               </w:rPr>
-              <w:t xml:space="preserve">Recommended action correct</w:t>
+              <w:t xml:space="preserve">Route matches the expected route</w:t>
+            </w:r>
+          </w:p>
+        </w:tc>
+        <w:tc>
+          <w:tcPr>
+            <w:tcW w:type="dxa" w:w="1808"/>
+            <w:tcBorders>
+              <w:top w:val="single" w:color="C9CED6" w:sz="4"/>
+              <w:left w:val="single" w:color="C9CED6" w:sz="4"/>
+              <w:bottom w:val="single" w:color="C9CED6" w:sz="4"/>
+              <w:right w:val="single" w:color="C9CED6" w:sz="4"/>
+            </w:tcBorders>
+            <w:tcMar>
+              <w:top w:type="dxa" w:w="70"/>
+              <w:left w:type="dxa" w:w="100"/>
+              <w:bottom w:type="dxa" w:w="70"/>
+              <w:right w:type="dxa" w:w="100"/>
+            </w:tcMar>
+            <w:vAlign w:val="top"/>
+          </w:tcPr>
+          <w:p>
+            <w:pPr>
+              <w:spacing w:after="20" w:line="252"/>
+            </w:pPr>
+            <w:r>
+              <w:rPr>
+                <w:rFonts w:ascii="Calibri" w:cs="Calibri" w:eastAsia="Calibri" w:hAnsi="Calibri"/>
+                <w:color w:val="1C2430"/>
+                <w:sz w:val="19"/>
+                <w:szCs w:val="19"/>
+              </w:rPr>
+              <w:t xml:space="preserve">60%</w:t>
             </w:r>
           </w:p>
         </w:tc>
@@ -22522,39 +22554,7 @@
                 <w:sz w:val="19"/>
                 <w:szCs w:val="19"/>
               </w:rPr>
-              <w:t xml:space="preserve">75%</w:t>
-            </w:r>
-          </w:p>
-        </w:tc>
-        <w:tc>
-          <w:tcPr>
-            <w:tcW w:type="dxa" w:w="1808"/>
-            <w:tcBorders>
-              <w:top w:val="single" w:color="C9CED6" w:sz="4"/>
-              <w:left w:val="single" w:color="C9CED6" w:sz="4"/>
-              <w:bottom w:val="single" w:color="C9CED6" w:sz="4"/>
-              <w:right w:val="single" w:color="C9CED6" w:sz="4"/>
-            </w:tcBorders>
-            <w:tcMar>
-              <w:top w:type="dxa" w:w="70"/>
-              <w:left w:type="dxa" w:w="100"/>
-              <w:bottom w:type="dxa" w:w="70"/>
-              <w:right w:type="dxa" w:w="100"/>
-            </w:tcMar>
-            <w:vAlign w:val="top"/>
-          </w:tcPr>
-          <w:p>
-            <w:pPr>
-              <w:spacing w:after="20" w:line="252"/>
-            </w:pPr>
-            <w:r>
-              <w:rPr>
-                <w:rFonts w:ascii="Calibri" w:cs="Calibri" w:eastAsia="Calibri" w:hAnsi="Calibri"/>
-                <w:color w:val="1C2430"/>
-                <w:sz w:val="19"/>
-                <w:szCs w:val="19"/>
-              </w:rPr>
-              <w:t xml:space="preserve">50%</w:t>
+              <w:t xml:space="preserve">87%</w:t>
             </w:r>
           </w:p>
         </w:tc>
@@ -22586,7 +22586,7 @@
                 <w:sz w:val="19"/>
                 <w:szCs w:val="19"/>
               </w:rPr>
-              <w:t xml:space="preserve">50%</w:t>
+              <w:t xml:space="preserve">69%</w:t>
             </w:r>
           </w:p>
         </w:tc>
@@ -22624,7 +22624,7 @@
                 <w:sz w:val="19"/>
                 <w:szCs w:val="19"/>
               </w:rPr>
-              <w:t xml:space="preserve">Route matches the expected route</w:t>
+              <w:t xml:space="preserve">Escalation decision correct</w:t>
             </w:r>
           </w:p>
         </w:tc>
@@ -22656,7 +22656,7 @@
                 <w:sz w:val="19"/>
                 <w:szCs w:val="19"/>
               </w:rPr>
-              <w:t xml:space="preserve">67%</w:t>
+              <w:t xml:space="preserve">73%</w:t>
             </w:r>
           </w:p>
         </w:tc>
@@ -22690,7 +22690,7 @@
                 <w:sz w:val="19"/>
                 <w:szCs w:val="19"/>
               </w:rPr>
-              <w:t xml:space="preserve">83%</w:t>
+              <w:t xml:space="preserve">87%</w:t>
             </w:r>
           </w:p>
         </w:tc>
@@ -22722,7 +22722,7 @@
                 <w:sz w:val="19"/>
                 <w:szCs w:val="19"/>
               </w:rPr>
-              <w:t xml:space="preserve">60%</w:t>
+              <w:t xml:space="preserve">77%</w:t>
             </w:r>
           </w:p>
         </w:tc>
@@ -22760,7 +22760,7 @@
                 <w:sz w:val="19"/>
                 <w:szCs w:val="19"/>
               </w:rPr>
-              <w:t xml:space="preserve">Escalation decision correct</w:t>
+              <w:t xml:space="preserve">False positives / false negatives</w:t>
             </w:r>
           </w:p>
         </w:tc>
@@ -22785,6 +22785,15 @@
             <w:pPr>
               <w:spacing w:after="20" w:line="252"/>
             </w:pPr>
+            <w:r>
+              <w:rPr>
+                <w:rFonts w:ascii="Calibri" w:cs="Calibri" w:eastAsia="Calibri" w:hAnsi="Calibri"/>
+                <w:color w:val="1C2430"/>
+                <w:sz w:val="19"/>
+                <w:szCs w:val="19"/>
+              </w:rPr>
+              <w:t xml:space="preserve">4 / </w:t>
+            </w:r>
             <w:r>
               <w:rPr>
                 <w:rFonts w:ascii="Calibri" w:cs="Calibri" w:eastAsia="Calibri" w:hAnsi="Calibri"/>
@@ -22794,7 +22803,7 @@
                 <w:sz w:val="19"/>
                 <w:szCs w:val="19"/>
               </w:rPr>
-              <w:t xml:space="preserve">83%</w:t>
+              <w:t xml:space="preserve">0</w:t>
             </w:r>
           </w:p>
         </w:tc>
@@ -22819,6 +22828,15 @@
             <w:pPr>
               <w:spacing w:after="20" w:line="252"/>
             </w:pPr>
+            <w:r>
+              <w:rPr>
+                <w:rFonts w:ascii="Calibri" w:cs="Calibri" w:eastAsia="Calibri" w:hAnsi="Calibri"/>
+                <w:color w:val="1C2430"/>
+                <w:sz w:val="19"/>
+                <w:szCs w:val="19"/>
+              </w:rPr>
+              <w:t xml:space="preserve">2 / </w:t>
+            </w:r>
             <w:r>
               <w:rPr>
                 <w:rFonts w:ascii="Calibri" w:cs="Calibri" w:eastAsia="Calibri" w:hAnsi="Calibri"/>
@@ -22828,7 +22846,7 @@
                 <w:sz w:val="19"/>
                 <w:szCs w:val="19"/>
               </w:rPr>
-              <w:t xml:space="preserve">83%</w:t>
+              <w:t xml:space="preserve">0</w:t>
             </w:r>
           </w:p>
         </w:tc>
@@ -22860,7 +22878,698 @@
                 <w:sz w:val="19"/>
                 <w:szCs w:val="19"/>
               </w:rPr>
-              <w:t xml:space="preserve">See Annex E</w:t>
+              <w:t xml:space="preserve">3 / </w:t>
+            </w:r>
+            <w:r>
+              <w:rPr>
+                <w:rFonts w:ascii="Calibri" w:cs="Calibri" w:eastAsia="Calibri" w:hAnsi="Calibri"/>
+                <w:b/>
+                <w:bCs/>
+                <w:color w:val="1C2430"/>
+                <w:sz w:val="19"/>
+                <w:szCs w:val="19"/>
+              </w:rPr>
+              <w:t xml:space="preserve">0</w:t>
+            </w:r>
+          </w:p>
+        </w:tc>
+      </w:tr>
+      <w:tr>
+        <w:trPr>
+          <w:cantSplit/>
+          <w:tblHeader w:val="false"/>
+        </w:trPr>
+        <w:tc>
+          <w:tcPr>
+            <w:tcW w:type="dxa" w:w="3600"/>
+            <w:tcBorders>
+              <w:top w:val="single" w:color="C9CED6" w:sz="4"/>
+              <w:left w:val="single" w:color="C9CED6" w:sz="4"/>
+              <w:bottom w:val="single" w:color="C9CED6" w:sz="4"/>
+              <w:right w:val="single" w:color="C9CED6" w:sz="4"/>
+            </w:tcBorders>
+            <w:tcMar>
+              <w:top w:type="dxa" w:w="70"/>
+              <w:left w:type="dxa" w:w="100"/>
+              <w:bottom w:type="dxa" w:w="70"/>
+              <w:right w:type="dxa" w:w="100"/>
+            </w:tcMar>
+            <w:vAlign w:val="top"/>
+          </w:tcPr>
+          <w:p>
+            <w:pPr>
+              <w:spacing w:after="20" w:line="252"/>
+            </w:pPr>
+            <w:r>
+              <w:rPr>
+                <w:rFonts w:ascii="Calibri" w:cs="Calibri" w:eastAsia="Calibri" w:hAnsi="Calibri"/>
+                <w:color w:val="1C2430"/>
+                <w:sz w:val="19"/>
+                <w:szCs w:val="19"/>
+              </w:rPr>
+              <w:t xml:space="preserve">Invented evidence IDs (caught by guardrail)</w:t>
+            </w:r>
+          </w:p>
+        </w:tc>
+        <w:tc>
+          <w:tcPr>
+            <w:tcW w:type="dxa" w:w="1808"/>
+            <w:tcBorders>
+              <w:top w:val="single" w:color="C9CED6" w:sz="4"/>
+              <w:left w:val="single" w:color="C9CED6" w:sz="4"/>
+              <w:bottom w:val="single" w:color="C9CED6" w:sz="4"/>
+              <w:right w:val="single" w:color="C9CED6" w:sz="4"/>
+            </w:tcBorders>
+            <w:tcMar>
+              <w:top w:type="dxa" w:w="70"/>
+              <w:left w:type="dxa" w:w="100"/>
+              <w:bottom w:type="dxa" w:w="70"/>
+              <w:right w:type="dxa" w:w="100"/>
+            </w:tcMar>
+            <w:vAlign w:val="top"/>
+          </w:tcPr>
+          <w:p>
+            <w:pPr>
+              <w:spacing w:after="20" w:line="252"/>
+            </w:pPr>
+            <w:r>
+              <w:rPr>
+                <w:rFonts w:ascii="Calibri" w:cs="Calibri" w:eastAsia="Calibri" w:hAnsi="Calibri"/>
+                <w:color w:val="1C2430"/>
+                <w:sz w:val="19"/>
+                <w:szCs w:val="19"/>
+              </w:rPr>
+              <w:t xml:space="preserve">6</w:t>
+            </w:r>
+          </w:p>
+        </w:tc>
+        <w:tc>
+          <w:tcPr>
+            <w:tcW w:type="dxa" w:w="1808"/>
+            <w:tcBorders>
+              <w:top w:val="single" w:color="C9CED6" w:sz="4"/>
+              <w:left w:val="single" w:color="C9CED6" w:sz="4"/>
+              <w:bottom w:val="single" w:color="C9CED6" w:sz="4"/>
+              <w:right w:val="single" w:color="C9CED6" w:sz="4"/>
+            </w:tcBorders>
+            <w:tcMar>
+              <w:top w:type="dxa" w:w="70"/>
+              <w:left w:type="dxa" w:w="100"/>
+              <w:bottom w:type="dxa" w:w="70"/>
+              <w:right w:type="dxa" w:w="100"/>
+            </w:tcMar>
+            <w:vAlign w:val="top"/>
+          </w:tcPr>
+          <w:p>
+            <w:pPr>
+              <w:spacing w:after="20" w:line="252"/>
+            </w:pPr>
+            <w:r>
+              <w:rPr>
+                <w:rFonts w:ascii="Calibri" w:cs="Calibri" w:eastAsia="Calibri" w:hAnsi="Calibri"/>
+                <w:color w:val="1C2430"/>
+                <w:sz w:val="19"/>
+                <w:szCs w:val="19"/>
+              </w:rPr>
+              <w:t xml:space="preserve">2</w:t>
+            </w:r>
+          </w:p>
+        </w:tc>
+        <w:tc>
+          <w:tcPr>
+            <w:tcW w:type="dxa" w:w="1810"/>
+            <w:tcBorders>
+              <w:top w:val="single" w:color="C9CED6" w:sz="4"/>
+              <w:left w:val="single" w:color="C9CED6" w:sz="4"/>
+              <w:bottom w:val="single" w:color="C9CED6" w:sz="4"/>
+              <w:right w:val="single" w:color="C9CED6" w:sz="4"/>
+            </w:tcBorders>
+            <w:tcMar>
+              <w:top w:type="dxa" w:w="70"/>
+              <w:left w:type="dxa" w:w="100"/>
+              <w:bottom w:type="dxa" w:w="70"/>
+              <w:right w:type="dxa" w:w="100"/>
+            </w:tcMar>
+            <w:vAlign w:val="top"/>
+          </w:tcPr>
+          <w:p>
+            <w:pPr>
+              <w:spacing w:after="20" w:line="252"/>
+            </w:pPr>
+            <w:r>
+              <w:rPr>
+                <w:rFonts w:ascii="Calibri" w:cs="Calibri" w:eastAsia="Calibri" w:hAnsi="Calibri"/>
+                <w:b/>
+                <w:bCs/>
+                <w:color w:val="1C2430"/>
+                <w:sz w:val="19"/>
+                <w:szCs w:val="19"/>
+              </w:rPr>
+              <w:t xml:space="preserve">0</w:t>
+            </w:r>
+          </w:p>
+        </w:tc>
+      </w:tr>
+      <w:tr>
+        <w:trPr>
+          <w:cantSplit/>
+          <w:tblHeader w:val="false"/>
+        </w:trPr>
+        <w:tc>
+          <w:tcPr>
+            <w:tcW w:type="dxa" w:w="3600"/>
+            <w:tcBorders>
+              <w:top w:val="single" w:color="C9CED6" w:sz="4"/>
+              <w:left w:val="single" w:color="C9CED6" w:sz="4"/>
+              <w:bottom w:val="single" w:color="C9CED6" w:sz="4"/>
+              <w:right w:val="single" w:color="C9CED6" w:sz="4"/>
+            </w:tcBorders>
+            <w:tcMar>
+              <w:top w:type="dxa" w:w="70"/>
+              <w:left w:type="dxa" w:w="100"/>
+              <w:bottom w:type="dxa" w:w="70"/>
+              <w:right w:type="dxa" w:w="100"/>
+            </w:tcMar>
+            <w:vAlign w:val="top"/>
+          </w:tcPr>
+          <w:p>
+            <w:pPr>
+              <w:spacing w:after="20" w:line="252"/>
+            </w:pPr>
+            <w:r>
+              <w:rPr>
+                <w:rFonts w:ascii="Calibri" w:cs="Calibri" w:eastAsia="Calibri" w:hAnsi="Calibri"/>
+                <w:color w:val="1C2430"/>
+                <w:sz w:val="19"/>
+                <w:szCs w:val="19"/>
+              </w:rPr>
+              <w:t xml:space="preserve">Valid JSON on first attempt</w:t>
+            </w:r>
+          </w:p>
+        </w:tc>
+        <w:tc>
+          <w:tcPr>
+            <w:tcW w:type="dxa" w:w="1808"/>
+            <w:tcBorders>
+              <w:top w:val="single" w:color="C9CED6" w:sz="4"/>
+              <w:left w:val="single" w:color="C9CED6" w:sz="4"/>
+              <w:bottom w:val="single" w:color="C9CED6" w:sz="4"/>
+              <w:right w:val="single" w:color="C9CED6" w:sz="4"/>
+            </w:tcBorders>
+            <w:tcMar>
+              <w:top w:type="dxa" w:w="70"/>
+              <w:left w:type="dxa" w:w="100"/>
+              <w:bottom w:type="dxa" w:w="70"/>
+              <w:right w:type="dxa" w:w="100"/>
+            </w:tcMar>
+            <w:vAlign w:val="top"/>
+          </w:tcPr>
+          <w:p>
+            <w:pPr>
+              <w:spacing w:after="20" w:line="252"/>
+            </w:pPr>
+            <w:r>
+              <w:rPr>
+                <w:rFonts w:ascii="Calibri" w:cs="Calibri" w:eastAsia="Calibri" w:hAnsi="Calibri"/>
+                <w:color w:val="1C2430"/>
+                <w:sz w:val="19"/>
+                <w:szCs w:val="19"/>
+              </w:rPr>
+              <w:t xml:space="preserve">90%</w:t>
+            </w:r>
+          </w:p>
+        </w:tc>
+        <w:tc>
+          <w:tcPr>
+            <w:tcW w:type="dxa" w:w="1808"/>
+            <w:tcBorders>
+              <w:top w:val="single" w:color="C9CED6" w:sz="4"/>
+              <w:left w:val="single" w:color="C9CED6" w:sz="4"/>
+              <w:bottom w:val="single" w:color="C9CED6" w:sz="4"/>
+              <w:right w:val="single" w:color="C9CED6" w:sz="4"/>
+            </w:tcBorders>
+            <w:tcMar>
+              <w:top w:type="dxa" w:w="70"/>
+              <w:left w:type="dxa" w:w="100"/>
+              <w:bottom w:type="dxa" w:w="70"/>
+              <w:right w:type="dxa" w:w="100"/>
+            </w:tcMar>
+            <w:vAlign w:val="top"/>
+          </w:tcPr>
+          <w:p>
+            <w:pPr>
+              <w:spacing w:after="20" w:line="252"/>
+            </w:pPr>
+            <w:r>
+              <w:rPr>
+                <w:rFonts w:ascii="Calibri" w:cs="Calibri" w:eastAsia="Calibri" w:hAnsi="Calibri"/>
+                <w:b/>
+                <w:bCs/>
+                <w:color w:val="1C2430"/>
+                <w:sz w:val="19"/>
+                <w:szCs w:val="19"/>
+              </w:rPr>
+              <w:t xml:space="preserve">98%</w:t>
+            </w:r>
+          </w:p>
+        </w:tc>
+        <w:tc>
+          <w:tcPr>
+            <w:tcW w:type="dxa" w:w="1810"/>
+            <w:tcBorders>
+              <w:top w:val="single" w:color="C9CED6" w:sz="4"/>
+              <w:left w:val="single" w:color="C9CED6" w:sz="4"/>
+              <w:bottom w:val="single" w:color="C9CED6" w:sz="4"/>
+              <w:right w:val="single" w:color="C9CED6" w:sz="4"/>
+            </w:tcBorders>
+            <w:tcMar>
+              <w:top w:type="dxa" w:w="70"/>
+              <w:left w:type="dxa" w:w="100"/>
+              <w:bottom w:type="dxa" w:w="70"/>
+              <w:right w:type="dxa" w:w="100"/>
+            </w:tcMar>
+            <w:vAlign w:val="top"/>
+          </w:tcPr>
+          <w:p>
+            <w:pPr>
+              <w:spacing w:after="20" w:line="252"/>
+            </w:pPr>
+            <w:r>
+              <w:rPr>
+                <w:rFonts w:ascii="Calibri" w:cs="Calibri" w:eastAsia="Calibri" w:hAnsi="Calibri"/>
+                <w:color w:val="1C2430"/>
+                <w:sz w:val="19"/>
+                <w:szCs w:val="19"/>
+              </w:rPr>
+              <w:t xml:space="preserve">95%</w:t>
+            </w:r>
+          </w:p>
+        </w:tc>
+      </w:tr>
+      <w:tr>
+        <w:trPr>
+          <w:cantSplit/>
+          <w:tblHeader w:val="false"/>
+        </w:trPr>
+        <w:tc>
+          <w:tcPr>
+            <w:tcW w:type="dxa" w:w="3600"/>
+            <w:tcBorders>
+              <w:top w:val="single" w:color="C9CED6" w:sz="4"/>
+              <w:left w:val="single" w:color="C9CED6" w:sz="4"/>
+              <w:bottom w:val="single" w:color="C9CED6" w:sz="4"/>
+              <w:right w:val="single" w:color="C9CED6" w:sz="4"/>
+            </w:tcBorders>
+            <w:tcMar>
+              <w:top w:type="dxa" w:w="70"/>
+              <w:left w:type="dxa" w:w="100"/>
+              <w:bottom w:type="dxa" w:w="70"/>
+              <w:right w:type="dxa" w:w="100"/>
+            </w:tcMar>
+            <w:vAlign w:val="top"/>
+          </w:tcPr>
+          <w:p>
+            <w:pPr>
+              <w:spacing w:after="20" w:line="252"/>
+            </w:pPr>
+            <w:r>
+              <w:rPr>
+                <w:rFonts w:ascii="Calibri" w:cs="Calibri" w:eastAsia="Calibri" w:hAnsi="Calibri"/>
+                <w:color w:val="1C2430"/>
+                <w:sz w:val="19"/>
+                <w:szCs w:val="19"/>
+              </w:rPr>
+              <w:t xml:space="preserve">Retries / rate-limited calls</w:t>
+            </w:r>
+          </w:p>
+        </w:tc>
+        <w:tc>
+          <w:tcPr>
+            <w:tcW w:type="dxa" w:w="1808"/>
+            <w:tcBorders>
+              <w:top w:val="single" w:color="C9CED6" w:sz="4"/>
+              <w:left w:val="single" w:color="C9CED6" w:sz="4"/>
+              <w:bottom w:val="single" w:color="C9CED6" w:sz="4"/>
+              <w:right w:val="single" w:color="C9CED6" w:sz="4"/>
+            </w:tcBorders>
+            <w:tcMar>
+              <w:top w:type="dxa" w:w="70"/>
+              <w:left w:type="dxa" w:w="100"/>
+              <w:bottom w:type="dxa" w:w="70"/>
+              <w:right w:type="dxa" w:w="100"/>
+            </w:tcMar>
+            <w:vAlign w:val="top"/>
+          </w:tcPr>
+          <w:p>
+            <w:pPr>
+              <w:spacing w:after="20" w:line="252"/>
+            </w:pPr>
+            <w:r>
+              <w:rPr>
+                <w:rFonts w:ascii="Calibri" w:cs="Calibri" w:eastAsia="Calibri" w:hAnsi="Calibri"/>
+                <w:color w:val="1C2430"/>
+                <w:sz w:val="19"/>
+                <w:szCs w:val="19"/>
+              </w:rPr>
+              <w:t xml:space="preserve">5 / 1</w:t>
+            </w:r>
+          </w:p>
+        </w:tc>
+        <w:tc>
+          <w:tcPr>
+            <w:tcW w:type="dxa" w:w="1808"/>
+            <w:tcBorders>
+              <w:top w:val="single" w:color="C9CED6" w:sz="4"/>
+              <w:left w:val="single" w:color="C9CED6" w:sz="4"/>
+              <w:bottom w:val="single" w:color="C9CED6" w:sz="4"/>
+              <w:right w:val="single" w:color="C9CED6" w:sz="4"/>
+            </w:tcBorders>
+            <w:tcMar>
+              <w:top w:type="dxa" w:w="70"/>
+              <w:left w:type="dxa" w:w="100"/>
+              <w:bottom w:type="dxa" w:w="70"/>
+              <w:right w:type="dxa" w:w="100"/>
+            </w:tcMar>
+            <w:vAlign w:val="top"/>
+          </w:tcPr>
+          <w:p>
+            <w:pPr>
+              <w:spacing w:after="20" w:line="252"/>
+            </w:pPr>
+            <w:r>
+              <w:rPr>
+                <w:rFonts w:ascii="Calibri" w:cs="Calibri" w:eastAsia="Calibri" w:hAnsi="Calibri"/>
+                <w:b/>
+                <w:bCs/>
+                <w:color w:val="1C2430"/>
+                <w:sz w:val="19"/>
+                <w:szCs w:val="19"/>
+              </w:rPr>
+              <w:t xml:space="preserve">2 / 1</w:t>
+            </w:r>
+          </w:p>
+        </w:tc>
+        <w:tc>
+          <w:tcPr>
+            <w:tcW w:type="dxa" w:w="1810"/>
+            <w:tcBorders>
+              <w:top w:val="single" w:color="C9CED6" w:sz="4"/>
+              <w:left w:val="single" w:color="C9CED6" w:sz="4"/>
+              <w:bottom w:val="single" w:color="C9CED6" w:sz="4"/>
+              <w:right w:val="single" w:color="C9CED6" w:sz="4"/>
+            </w:tcBorders>
+            <w:tcMar>
+              <w:top w:type="dxa" w:w="70"/>
+              <w:left w:type="dxa" w:w="100"/>
+              <w:bottom w:type="dxa" w:w="70"/>
+              <w:right w:type="dxa" w:w="100"/>
+            </w:tcMar>
+            <w:vAlign w:val="top"/>
+          </w:tcPr>
+          <w:p>
+            <w:pPr>
+              <w:spacing w:after="20" w:line="252"/>
+            </w:pPr>
+            <w:r>
+              <w:rPr>
+                <w:rFonts w:ascii="Calibri" w:cs="Calibri" w:eastAsia="Calibri" w:hAnsi="Calibri"/>
+                <w:color w:val="1C2430"/>
+                <w:sz w:val="19"/>
+                <w:szCs w:val="19"/>
+              </w:rPr>
+              <w:t xml:space="preserve">10 / 9</w:t>
+            </w:r>
+          </w:p>
+        </w:tc>
+      </w:tr>
+      <w:tr>
+        <w:trPr>
+          <w:cantSplit/>
+          <w:tblHeader w:val="false"/>
+        </w:trPr>
+        <w:tc>
+          <w:tcPr>
+            <w:tcW w:type="dxa" w:w="3600"/>
+            <w:tcBorders>
+              <w:top w:val="single" w:color="C9CED6" w:sz="4"/>
+              <w:left w:val="single" w:color="C9CED6" w:sz="4"/>
+              <w:bottom w:val="single" w:color="C9CED6" w:sz="4"/>
+              <w:right w:val="single" w:color="C9CED6" w:sz="4"/>
+            </w:tcBorders>
+            <w:tcMar>
+              <w:top w:type="dxa" w:w="70"/>
+              <w:left w:type="dxa" w:w="100"/>
+              <w:bottom w:type="dxa" w:w="70"/>
+              <w:right w:type="dxa" w:w="100"/>
+            </w:tcMar>
+            <w:vAlign w:val="top"/>
+          </w:tcPr>
+          <w:p>
+            <w:pPr>
+              <w:spacing w:after="20" w:line="252"/>
+            </w:pPr>
+            <w:r>
+              <w:rPr>
+                <w:rFonts w:ascii="Calibri" w:cs="Calibri" w:eastAsia="Calibri" w:hAnsi="Calibri"/>
+                <w:color w:val="1C2430"/>
+                <w:sz w:val="19"/>
+                <w:szCs w:val="19"/>
+              </w:rPr>
+              <w:t xml:space="preserve">Median model time per case</w:t>
+            </w:r>
+          </w:p>
+        </w:tc>
+        <w:tc>
+          <w:tcPr>
+            <w:tcW w:type="dxa" w:w="1808"/>
+            <w:tcBorders>
+              <w:top w:val="single" w:color="C9CED6" w:sz="4"/>
+              <w:left w:val="single" w:color="C9CED6" w:sz="4"/>
+              <w:bottom w:val="single" w:color="C9CED6" w:sz="4"/>
+              <w:right w:val="single" w:color="C9CED6" w:sz="4"/>
+            </w:tcBorders>
+            <w:tcMar>
+              <w:top w:type="dxa" w:w="70"/>
+              <w:left w:type="dxa" w:w="100"/>
+              <w:bottom w:type="dxa" w:w="70"/>
+              <w:right w:type="dxa" w:w="100"/>
+            </w:tcMar>
+            <w:vAlign w:val="top"/>
+          </w:tcPr>
+          <w:p>
+            <w:pPr>
+              <w:spacing w:after="20" w:line="252"/>
+            </w:pPr>
+            <w:r>
+              <w:rPr>
+                <w:rFonts w:ascii="Calibri" w:cs="Calibri" w:eastAsia="Calibri" w:hAnsi="Calibri"/>
+                <w:b/>
+                <w:bCs/>
+                <w:color w:val="1C2430"/>
+                <w:sz w:val="19"/>
+                <w:szCs w:val="19"/>
+              </w:rPr>
+              <w:t xml:space="preserve">6.0 s</w:t>
+            </w:r>
+          </w:p>
+        </w:tc>
+        <w:tc>
+          <w:tcPr>
+            <w:tcW w:type="dxa" w:w="1808"/>
+            <w:tcBorders>
+              <w:top w:val="single" w:color="C9CED6" w:sz="4"/>
+              <w:left w:val="single" w:color="C9CED6" w:sz="4"/>
+              <w:bottom w:val="single" w:color="C9CED6" w:sz="4"/>
+              <w:right w:val="single" w:color="C9CED6" w:sz="4"/>
+            </w:tcBorders>
+            <w:tcMar>
+              <w:top w:type="dxa" w:w="70"/>
+              <w:left w:type="dxa" w:w="100"/>
+              <w:bottom w:type="dxa" w:w="70"/>
+              <w:right w:type="dxa" w:w="100"/>
+            </w:tcMar>
+            <w:vAlign w:val="top"/>
+          </w:tcPr>
+          <w:p>
+            <w:pPr>
+              <w:spacing w:after="20" w:line="252"/>
+            </w:pPr>
+            <w:r>
+              <w:rPr>
+                <w:rFonts w:ascii="Calibri" w:cs="Calibri" w:eastAsia="Calibri" w:hAnsi="Calibri"/>
+                <w:color w:val="1C2430"/>
+                <w:sz w:val="19"/>
+                <w:szCs w:val="19"/>
+              </w:rPr>
+              <w:t xml:space="preserve">8.6 s</w:t>
+            </w:r>
+          </w:p>
+        </w:tc>
+        <w:tc>
+          <w:tcPr>
+            <w:tcW w:type="dxa" w:w="1810"/>
+            <w:tcBorders>
+              <w:top w:val="single" w:color="C9CED6" w:sz="4"/>
+              <w:left w:val="single" w:color="C9CED6" w:sz="4"/>
+              <w:bottom w:val="single" w:color="C9CED6" w:sz="4"/>
+              <w:right w:val="single" w:color="C9CED6" w:sz="4"/>
+            </w:tcBorders>
+            <w:tcMar>
+              <w:top w:type="dxa" w:w="70"/>
+              <w:left w:type="dxa" w:w="100"/>
+              <w:bottom w:type="dxa" w:w="70"/>
+              <w:right w:type="dxa" w:w="100"/>
+            </w:tcMar>
+            <w:vAlign w:val="top"/>
+          </w:tcPr>
+          <w:p>
+            <w:pPr>
+              <w:spacing w:after="20" w:line="252"/>
+            </w:pPr>
+            <w:r>
+              <w:rPr>
+                <w:rFonts w:ascii="Calibri" w:cs="Calibri" w:eastAsia="Calibri" w:hAnsi="Calibri"/>
+                <w:color w:val="1C2430"/>
+                <w:sz w:val="19"/>
+                <w:szCs w:val="19"/>
+              </w:rPr>
+              <w:t xml:space="preserve">6.1 s</w:t>
+            </w:r>
+          </w:p>
+        </w:tc>
+      </w:tr>
+      <w:tr>
+        <w:trPr>
+          <w:cantSplit/>
+          <w:tblHeader w:val="false"/>
+        </w:trPr>
+        <w:tc>
+          <w:tcPr>
+            <w:tcW w:type="dxa" w:w="3600"/>
+            <w:tcBorders>
+              <w:top w:val="single" w:color="C9CED6" w:sz="4"/>
+              <w:left w:val="single" w:color="C9CED6" w:sz="4"/>
+              <w:bottom w:val="single" w:color="C9CED6" w:sz="4"/>
+              <w:right w:val="single" w:color="C9CED6" w:sz="4"/>
+            </w:tcBorders>
+            <w:tcMar>
+              <w:top w:type="dxa" w:w="70"/>
+              <w:left w:type="dxa" w:w="100"/>
+              <w:bottom w:type="dxa" w:w="70"/>
+              <w:right w:type="dxa" w:w="100"/>
+            </w:tcMar>
+            <w:vAlign w:val="top"/>
+          </w:tcPr>
+          <w:p>
+            <w:pPr>
+              <w:spacing w:after="20" w:line="252"/>
+            </w:pPr>
+            <w:r>
+              <w:rPr>
+                <w:rFonts w:ascii="Calibri" w:cs="Calibri" w:eastAsia="Calibri" w:hAnsi="Calibri"/>
+                <w:color w:val="1C2430"/>
+                <w:sz w:val="19"/>
+                <w:szCs w:val="19"/>
+              </w:rPr>
+              <w:t xml:space="preserve">Task completion (reached the designed end state)</w:t>
+            </w:r>
+          </w:p>
+        </w:tc>
+        <w:tc>
+          <w:tcPr>
+            <w:tcW w:type="dxa" w:w="1808"/>
+            <w:tcBorders>
+              <w:top w:val="single" w:color="C9CED6" w:sz="4"/>
+              <w:left w:val="single" w:color="C9CED6" w:sz="4"/>
+              <w:bottom w:val="single" w:color="C9CED6" w:sz="4"/>
+              <w:right w:val="single" w:color="C9CED6" w:sz="4"/>
+            </w:tcBorders>
+            <w:tcMar>
+              <w:top w:type="dxa" w:w="70"/>
+              <w:left w:type="dxa" w:w="100"/>
+              <w:bottom w:type="dxa" w:w="70"/>
+              <w:right w:type="dxa" w:w="100"/>
+            </w:tcMar>
+            <w:vAlign w:val="top"/>
+          </w:tcPr>
+          <w:p>
+            <w:pPr>
+              <w:spacing w:after="20" w:line="252"/>
+            </w:pPr>
+            <w:r>
+              <w:rPr>
+                <w:rFonts w:ascii="Calibri" w:cs="Calibri" w:eastAsia="Calibri" w:hAnsi="Calibri"/>
+                <w:color w:val="1C2430"/>
+                <w:sz w:val="19"/>
+                <w:szCs w:val="19"/>
+              </w:rPr>
+              <w:t xml:space="preserve">60%</w:t>
+            </w:r>
+          </w:p>
+        </w:tc>
+        <w:tc>
+          <w:tcPr>
+            <w:tcW w:type="dxa" w:w="1808"/>
+            <w:tcBorders>
+              <w:top w:val="single" w:color="C9CED6" w:sz="4"/>
+              <w:left w:val="single" w:color="C9CED6" w:sz="4"/>
+              <w:bottom w:val="single" w:color="C9CED6" w:sz="4"/>
+              <w:right w:val="single" w:color="C9CED6" w:sz="4"/>
+            </w:tcBorders>
+            <w:tcMar>
+              <w:top w:type="dxa" w:w="70"/>
+              <w:left w:type="dxa" w:w="100"/>
+              <w:bottom w:type="dxa" w:w="70"/>
+              <w:right w:type="dxa" w:w="100"/>
+            </w:tcMar>
+            <w:vAlign w:val="top"/>
+          </w:tcPr>
+          <w:p>
+            <w:pPr>
+              <w:spacing w:after="20" w:line="252"/>
+            </w:pPr>
+            <w:r>
+              <w:rPr>
+                <w:rFonts w:ascii="Calibri" w:cs="Calibri" w:eastAsia="Calibri" w:hAnsi="Calibri"/>
+                <w:b/>
+                <w:bCs/>
+                <w:color w:val="1C2430"/>
+                <w:sz w:val="19"/>
+                <w:szCs w:val="19"/>
+              </w:rPr>
+              <w:t xml:space="preserve">87%</w:t>
+            </w:r>
+          </w:p>
+        </w:tc>
+        <w:tc>
+          <w:tcPr>
+            <w:tcW w:type="dxa" w:w="1810"/>
+            <w:tcBorders>
+              <w:top w:val="single" w:color="C9CED6" w:sz="4"/>
+              <w:left w:val="single" w:color="C9CED6" w:sz="4"/>
+              <w:bottom w:val="single" w:color="C9CED6" w:sz="4"/>
+              <w:right w:val="single" w:color="C9CED6" w:sz="4"/>
+            </w:tcBorders>
+            <w:tcMar>
+              <w:top w:type="dxa" w:w="70"/>
+              <w:left w:type="dxa" w:w="100"/>
+              <w:bottom w:type="dxa" w:w="70"/>
+              <w:right w:type="dxa" w:w="100"/>
+            </w:tcMar>
+            <w:vAlign w:val="top"/>
+          </w:tcPr>
+          <w:p>
+            <w:pPr>
+              <w:spacing w:after="20" w:line="252"/>
+            </w:pPr>
+            <w:r>
+              <w:rPr>
+                <w:rFonts w:ascii="Calibri" w:cs="Calibri" w:eastAsia="Calibri" w:hAnsi="Calibri"/>
+                <w:color w:val="1C2430"/>
+                <w:sz w:val="19"/>
+                <w:szCs w:val="19"/>
+              </w:rPr>
+              <w:t xml:space="preserve">60%</w:t>
             </w:r>
           </w:p>
         </w:tc>
@@ -22901,7 +23610,7 @@
           <w:sz w:val="22"/>
           <w:szCs w:val="22"/>
         </w:rPr>
-        <w:t xml:space="preserve"> (Figure 25). The same file records, per model, false positives and negatives, invented evidence IDs caught by the guardrail, JSON validity on the first attempt, retries, rate-limited calls, latency and task completion; raw per-run data is in </w:t>
+        <w:t xml:space="preserve"> (Figure 25); raw per-run data is in </w:t>
       </w:r>
       <w:r>
         <w:rPr>
@@ -22919,7 +23628,7 @@
           <w:sz w:val="22"/>
           <w:szCs w:val="22"/>
         </w:rPr>
-        <w:t xml:space="preserve"> (Annex E). Explanation quality has not yet been scored; the blind rubric sheet is generated for that step.</w:t>
+        <w:t xml:space="preserve"> (Annex E). A false positive here means a case that was escalated or sent to the exception queue when the expected route was review or closure, which is the safe direction of error. Explanation quality has not yet been scored; the blind rubric sheet is generated for that step.</w:t>
       </w:r>
     </w:p>
     <w:p>
@@ -23027,25 +23736,7 @@
           <w:sz w:val="22"/>
           <w:szCs w:val="22"/>
         </w:rPr>
-        <w:t xml:space="preserve"> Both GPT-OSS models ended with the correct final risk class in every scored run; Qwen 3.8 27B did so in half. Qwen's within-one rate equals its exact rate, so its misses are not near-misses on the risk scale. They are more likely runs that ended without a usable model result; the cause of each one is recorded in </w:t>
-      </w:r>
-      <w:r>
-        <w:rPr>
-          <w:rFonts w:ascii="Consolas" w:cs="Consolas" w:eastAsia="Consolas" w:hAnsi="Consolas"/>
-          <w:color w:val="1C2430"/>
-          <w:sz w:val="20"/>
-          <w:szCs w:val="20"/>
-        </w:rPr>
-        <w:t xml:space="preserve">runs.csv</w:t>
-      </w:r>
-      <w:r>
-        <w:rPr>
-          <w:rFonts w:ascii="Calibri" w:cs="Calibri" w:eastAsia="Calibri" w:hAnsi="Calibri"/>
-          <w:color w:val="1C2430"/>
-          <w:sz w:val="22"/>
-          <w:szCs w:val="22"/>
-        </w:rPr>
-        <w:t xml:space="preserve">.</w:t>
+        <w:t xml:space="preserve"> Both GPT-OSS models ended with the correct final risk class in every scored run; Qwen 3.8 27B did so in 57%. Qwen's within-one rate equals its exact rate, so its misses are not near-misses on the risk scale: they are runs in which an agent call failed (mostly the threat-intelligence agent, after repeated provider throttling) and the case went to the manual queue without a class.</w:t>
       </w:r>
     </w:p>
     <w:p>
@@ -23071,7 +23762,7 @@
           <w:sz w:val="22"/>
           <w:szCs w:val="22"/>
         </w:rPr>
-        <w:t xml:space="preserve"> The final class is computed in code from the evidence, so the model's own suggestion is scored separately. GPT-OSS 20B agreed with the expected answer most often (75% for class, category and action), ahead of GPT-OSS 120B (50%, 25% and 50%) and Qwen (50%). Where a model under- or over-called a case, the code scoring and override rules still produced the correct final class. This is the property the design relies on: the model advises, code decides.</w:t>
+        <w:t xml:space="preserve"> The final class is computed in code from the evidence, so the model's own suggestion is scored separately. GPT-OSS 20B agreed with the expected answer most often (78% for class, 89% for category), while GPT-OSS 120B was usually one level off (it proposed HIGH for both the MEDIUM and the CRITICAL case, 33% exact). In every such case the code scoring and override rules still produced the correct final class. This is the property the design relies on: the model advises, code decides.</w:t>
       </w:r>
     </w:p>
     <w:p>
@@ -23088,7 +23779,7 @@
           <w:sz w:val="22"/>
           <w:szCs w:val="22"/>
         </w:rPr>
-        <w:t xml:space="preserve">Routing, escalation and safety.</w:t>
+        <w:t xml:space="preserve">Safety.</w:t>
       </w:r>
       <w:r>
         <w:rPr>
@@ -23097,7 +23788,7 @@
           <w:sz w:val="22"/>
           <w:szCs w:val="22"/>
         </w:rPr>
-        <w:t xml:space="preserve"> GPT-OSS 120B matched the expected route most often (83%), against 67% for GPT-OSS 20B and 60% for Qwen. Both GPT-OSS models made the correct escalate-or-not decision in 5 of 6 runs. Every route, including closure, ends with a human decision, so a routing miss costs analyst time rather than causing an unreviewed closure or action.</w:t>
+        <w:t xml:space="preserve"> No model produced a false negative: every attack that should have been escalated was escalated. All false positives were cases sent to the exception queue or escalated instead of reviewed, which costs analyst time but never closes a real incident.</w:t>
       </w:r>
     </w:p>
     <w:p>
@@ -23114,7 +23805,7 @@
           <w:sz w:val="22"/>
           <w:szCs w:val="22"/>
         </w:rPr>
-        <w:t xml:space="preserve">Structured output, guardrails and speed.</w:t>
+        <w:t xml:space="preserve">Structured output and guardrails.</w:t>
       </w:r>
       <w:r>
         <w:rPr>
@@ -23123,7 +23814,7 @@
           <w:sz w:val="22"/>
           <w:szCs w:val="22"/>
         </w:rPr>
-        <w:t xml:space="preserve"> JSON validity, retries and invented-ID catches for each model are recorded in the benchmark files (Annex E); the guardrails sent any invalid or unsupported output to the exception queue, never to an analyst as a trusted recommendation. Latency in this run is dominated by the deliberate pause between agent calls that keeps the workflow inside the provider's free tier, so it does not separate the models.</w:t>
+        <w:t xml:space="preserve"> GPT-OSS 120B was the most reliable at structured output (98% valid JSON on the first attempt, 2 retries). GPT-OSS 20B cited evidence IDs that did not exist six times; the output guardrail caught every one and sent those cases to a human. Together with two summary-agent failures, this is why its route match and task completion are lower (60%). Qwen invented none, but needed 10 retries and was throttled 9 times by the provider, with two runs timing out.</w:t>
       </w:r>
     </w:p>
     <w:p>
@@ -23140,7 +23831,7 @@
           <w:sz w:val="22"/>
           <w:szCs w:val="22"/>
         </w:rPr>
-        <w:t xml:space="preserve">Recommendation.</w:t>
+        <w:t xml:space="preserve">Speed versus quality.</w:t>
       </w:r>
       <w:r>
         <w:rPr>
@@ -23149,8 +23840,14 @@
           <w:sz w:val="22"/>
           <w:szCs w:val="22"/>
         </w:rPr>
-        <w:t xml:space="preserve"> We recommend </w:t>
-      </w:r>
+        <w:t xml:space="preserve"> Median model time per case was 6.0 s for GPT-OSS 20B, 6.1 s for Qwen and 8.6 s for GPT-OSS 120B. End-to-end time is dominated by the deliberate pause between agent calls that keeps the workflow inside the free tier, so the extra 2.6 s for the larger model is not material for triage.</w:t>
+      </w:r>
+    </w:p>
+    <w:p>
+      <w:pPr>
+        <w:spacing w:after="140" w:line="288"/>
+        <w:jc w:val="both"/>
+      </w:pPr>
       <w:r>
         <w:rPr>
           <w:rFonts w:ascii="Calibri" w:cs="Calibri" w:eastAsia="Calibri" w:hAnsi="Calibri"/>
@@ -23160,7 +23857,7 @@
           <w:sz w:val="22"/>
           <w:szCs w:val="22"/>
         </w:rPr>
-        <w:t xml:space="preserve">GPT-OSS 120B</w:t>
+        <w:t xml:space="preserve">Recommendation.</w:t>
       </w:r>
       <w:r>
         <w:rPr>
@@ -23169,7 +23866,7 @@
           <w:sz w:val="22"/>
           <w:szCs w:val="22"/>
         </w:rPr>
-        <w:t xml:space="preserve"> as the primary model for a pilot: correct final class in every run and the best routing. </w:t>
+        <w:t xml:space="preserve"> We recommend </w:t>
       </w:r>
       <w:r>
         <w:rPr>
@@ -23180,7 +23877,7 @@
           <w:sz w:val="22"/>
           <w:szCs w:val="22"/>
         </w:rPr>
-        <w:t xml:space="preserve">GPT-OSS 20B</w:t>
+        <w:t xml:space="preserve">GPT-OSS 120B</w:t>
       </w:r>
       <w:r>
         <w:rPr>
@@ -23189,7 +23886,27 @@
           <w:sz w:val="22"/>
           <w:szCs w:val="22"/>
         </w:rPr>
-        <w:t xml:space="preserve"> is the fallback for high alert volumes, with the same final accuracy and the best agreement in its own proposals. Qwen 3.8 27B is not recommended until its incomplete runs are explained. Before a pilot, the benchmark should be repeated with an equal number of runs per model (5 alerts × 3 repeats) and blind explanation scoring.</w:t>
+        <w:t xml:space="preserve"> as the primary model for a pilot: correct final class in every run, the highest route match, escalation accuracy and task completion (87%), the most reliable JSON, and only two invented IDs. </w:t>
+      </w:r>
+      <w:r>
+        <w:rPr>
+          <w:rFonts w:ascii="Calibri" w:cs="Calibri" w:eastAsia="Calibri" w:hAnsi="Calibri"/>
+          <w:b/>
+          <w:bCs/>
+          <w:color w:val="1C2430"/>
+          <w:sz w:val="22"/>
+          <w:szCs w:val="22"/>
+        </w:rPr>
+        <w:t xml:space="preserve">GPT-OSS 20B</w:t>
+      </w:r>
+      <w:r>
+        <w:rPr>
+          <w:rFonts w:ascii="Calibri" w:cs="Calibri" w:eastAsia="Calibri" w:hAnsi="Calibri"/>
+          <w:color w:val="1C2430"/>
+          <w:sz w:val="22"/>
+          <w:szCs w:val="22"/>
+        </w:rPr>
+        <w:t xml:space="preserve"> is the fastest and its own proposals were the most accurate, but its invented evidence IDs make it a fallback only after prompt tuning. Qwen 3.8 27B, a preview model, is not recommended until its throttling and time-outs are resolved. Before a pilot, explanation quality should be scored blind and the benchmark repeated on a larger alert set.</w:t>
       </w:r>
     </w:p>
     <w:p>

</xml_diff>